<commit_message>
Marca las separaciones estróficas hasta Cíclope
</commit_message>
<xml_diff>
--- a/jdown/docx/odisea7_ciclope.docx
+++ b/jdown/docx/odisea7_ciclope.docx
@@ -22,8 +22,15 @@
       <w:pPr>
         <w:pStyle w:val="FirstParagraph"/>
       </w:pPr>
-      <w:r>
-        <w:t xml:space="preserve">Hasta aquí, Christopher y el que suscribe no han llegado a las manos. Darle un tajo a Helena en el rostro es simplista, pero la escena de Esparta fluye, Lupita Nyong’o está divina y Jon Bernthal interpreta a un convincente Menelao. Eliminar a Nausícaa es un pecado capital y quitar de en medio a los feacios una blasfemia digna de excomunión, pero, ¡ay!, así son las exigencias del guion.</w:t>
+      <w:bookmarkStart w:id="9" w:name="cap:ciclope"/>
+      <w:bookmarkEnd w:id="9"/>
+    </w:p>
+    <w:p>
+      <w:pPr>
+        <w:pStyle w:val="BodyText"/>
+      </w:pPr>
+      <w:r>
+        <w:t xml:space="preserve">Hasta el momento, sir Christopher y el que suscribe no han llegado a las manos. Darle un tajo a Helena en el rostro es simplista, pero la escena de Esparta fluye, Lupita Nyong’o está divina y Jon Bernthal interpreta a un convincente Menelao. Eliminar a Nausícaa es un pecado capital y quitar de en medio a los feacios una blasfemia digna de excomunión, pero, ¡ay!, así son las exigencias del guion.</w:t>
       </w:r>
     </w:p>
     <w:p>
@@ -75,173 +82,83 @@
         <w:pStyle w:val="BodyText"/>
       </w:pPr>
       <w:r>
-        <w:t xml:space="preserve">Pero dejemos que sea Homero quien nos guíe en este fenomenal episodio. Recordemos que Ulises está contando sus cuitas en la corte de Alcínoo —por tanto narrando en primera persona—. Han salido por piernas después de vérselas con los cícones y de pasar por el país de los lotófagos —un pequeño episodio que Nolan se salta, a cambio de convertir a Charlize, digo a Calipso, en una traficante del género—. Lo cierto es que en mi versión de Ítaca, el viejo Ulises recuerda, quizás inexactamente —o quizás es el Poeta el que se salta detalles— lo que pasó:</w:t>
-      </w:r>
-    </w:p>
-    <w:p>
-      <w:pPr>
-        <w:pStyle w:val="BlockText"/>
-      </w:pPr>
-      <w:r>
-        <w:t xml:space="preserve">Tal vez nunca creíste en dioses,</w:t>
-      </w:r>
-      <w:r>
-        <w:br/>
-      </w:r>
-      <w:r>
-        <w:t xml:space="preserve">y por esta razón siempre estabas cauteloso y alerta.</w:t>
-      </w:r>
-      <w:r>
-        <w:br/>
-      </w:r>
-      <w:r>
-        <w:t xml:space="preserve">¿Recuerdas el país de los comedores de loto? Todos tus hombres</w:t>
-      </w:r>
-      <w:r>
-        <w:br/>
-      </w:r>
-      <w:r>
-        <w:t xml:space="preserve">estaban drogados y roncando cinco minutos después de desembarcar,</w:t>
-      </w:r>
-      <w:r>
-        <w:br/>
-      </w:r>
-      <w:r>
-        <w:t xml:space="preserve">tú no. De alguna manera, sentías el peligro</w:t>
-      </w:r>
-      <w:r>
-        <w:br/>
-      </w:r>
-      <w:r>
-        <w:t xml:space="preserve">en las bellas personas que te ofrecían flores,</w:t>
-      </w:r>
-      <w:r>
-        <w:br/>
-      </w:r>
-      <w:r>
-        <w:t xml:space="preserve">peligro en el cielo azul, en el agua tranquila,</w:t>
-      </w:r>
-      <w:r>
-        <w:br/>
-      </w:r>
-      <w:r>
-        <w:t xml:space="preserve">peligro en el día perfecto, que invitaba al viajero</w:t>
-      </w:r>
-      <w:r>
-        <w:br/>
-      </w:r>
-      <w:r>
-        <w:t xml:space="preserve">a tumbarse en la arena, a cerrar sus ojos cansados</w:t>
-      </w:r>
-      <w:r>
-        <w:br/>
-      </w:r>
-      <w:r>
-        <w:t xml:space="preserve">y dormir.</w:t>
-      </w:r>
-      <w:r>
-        <w:br/>
-      </w:r>
-      <w:r>
-        <w:t xml:space="preserve">Tú, dormir no lo hiciste. La belleza</w:t>
-      </w:r>
-      <w:r>
-        <w:br/>
-      </w:r>
-      <w:r>
-        <w:t xml:space="preserve">te asustaba más que el único y ardiente ojo de Polifemo.</w:t>
-      </w:r>
-      <w:r>
-        <w:br/>
-      </w:r>
-      <w:r>
-        <w:t xml:space="preserve">Esos cuerpos perfectos y ágiles, desnudos bajo el sol,</w:t>
-      </w:r>
-      <w:r>
-        <w:br/>
-      </w:r>
-      <w:r>
-        <w:t xml:space="preserve">de alguna manera deletreaban Muerte.</w:t>
-      </w:r>
-    </w:p>
-    <w:p>
-      <w:pPr>
-        <w:pStyle w:val="BlockText"/>
-      </w:pPr>
-      <w:r>
-        <w:t xml:space="preserve">Belleza y muerte. Cuando caminas por la costa</w:t>
-      </w:r>
-      <w:r>
-        <w:br/>
-      </w:r>
-      <w:r>
-        <w:t xml:space="preserve">de tu pequeña isla, escuchando los gritos de las gaviotas,</w:t>
-      </w:r>
-      <w:r>
-        <w:br/>
-      </w:r>
-      <w:r>
-        <w:t xml:space="preserve">—a menudo oyes las voces de Áyax, de Aquiles,</w:t>
-      </w:r>
-      <w:r>
-        <w:br/>
-      </w:r>
-      <w:r>
-        <w:t xml:space="preserve">incluso de Héctor, llamándote desde el Hades—,</w:t>
-      </w:r>
-      <w:r>
-        <w:br/>
-      </w:r>
-      <w:r>
-        <w:t xml:space="preserve">cuando paseas entre los naranjos, oliendo la fragancia</w:t>
-      </w:r>
-      <w:r>
-        <w:br/>
-      </w:r>
-      <w:r>
-        <w:t xml:space="preserve">de las flores de primavera —tan dulces como el loto que rehusaste comer—,</w:t>
-      </w:r>
-      <w:r>
-        <w:br/>
-      </w:r>
-      <w:r>
-        <w:t xml:space="preserve">cuando miras el cielo estrellado durante la noche,</w:t>
-      </w:r>
-      <w:r>
-        <w:br/>
-      </w:r>
-      <w:r>
-        <w:t xml:space="preserve">¿por qué tu alma se estremece de anhelo y de deseo?</w:t>
-      </w:r>
-      <w:r>
-        <w:br/>
-      </w:r>
-      <w:r>
-        <w:t xml:space="preserve">¿por qué tu corazón se siente pesado y ligero a la vez?</w:t>
-      </w:r>
-      <w:r>
-        <w:br/>
-      </w:r>
-      <w:r>
-        <w:t xml:space="preserve">Tal vez sea la noción</w:t>
-      </w:r>
-      <w:r>
-        <w:br/>
-      </w:r>
-      <w:r>
-        <w:t xml:space="preserve">de que gaviotas y flores y estrellas</w:t>
-      </w:r>
-      <w:r>
-        <w:br/>
-      </w:r>
-      <w:r>
-        <w:t xml:space="preserve">aún seguirán ahí,</w:t>
-      </w:r>
-      <w:r>
-        <w:br/>
-      </w:r>
-      <w:r>
-        <w:t xml:space="preserve">cuando tú te hayas ido.</w:t>
+        <w:t xml:space="preserve">Pero dejemos que sea Homero quien nos guíe en este fenomenal episodio. Recordemos que Ulises está contando sus cuitas en la corte de Alcínoo —por tanto narrando en primera persona—. Han salido por piernas después de vérselas con los cícones y de pasar por el país de los lotófagos, un pequeño episodio que Nolan se salta, a cambio de convertir a Charlize, digo a Calipso, en una traficante del género.</w:t>
+      </w:r>
+    </w:p>
+    <w:p>
+      <w:pPr>
+        <w:pStyle w:val="BodyText"/>
+      </w:pPr>
+      <w:r>
+        <w:t xml:space="preserve">Por fin llegan a la isla de los Cíclopes, que resultan ser una panda de gandules, dándose la gran vida a expensas de los favores de los dioses:</w:t>
+      </w:r>
+    </w:p>
+    <w:p>
+      <w:pPr>
+        <w:pStyle w:val="BlockText"/>
+      </w:pPr>
+      <w:r>
+        <w:t xml:space="preserve">De allí otra vez navegamos con el corazón sombritriste,</w:t>
+      </w:r>
+      <w:r>
+        <w:br/>
+      </w:r>
+      <w:r>
+        <w:t xml:space="preserve">hasta que a patria de unos altivos sin ley, de los Cíclopes,</w:t>
+      </w:r>
+      <w:r>
+        <w:br/>
+      </w:r>
+      <w:r>
+        <w:t xml:space="preserve">fuimos a dar, que fiando ellos siempre en los dioses felices,</w:t>
+      </w:r>
+      <w:r>
+        <w:br/>
+      </w:r>
+      <w:r>
+        <w:t xml:space="preserve">ni aran la tierra ni siembran semilla que luego germine,</w:t>
+      </w:r>
+      <w:r>
+        <w:br/>
+      </w:r>
+      <w:r>
+        <w:t xml:space="preserve">pero sin siembra ni arada a ellos todo les nace y les rinde,</w:t>
+      </w:r>
+      <w:r>
+        <w:br/>
+      </w:r>
+      <w:r>
+        <w:t xml:space="preserve">los trigos y las cebadas y los racimos en vides</w:t>
+      </w:r>
+      <w:r>
+        <w:br/>
+      </w:r>
+      <w:r>
+        <w:t xml:space="preserve">llenos de vino que Zeus con su lluvia les infla y bendice.</w:t>
+      </w:r>
+      <w:r>
+        <w:br/>
+      </w:r>
+      <w:r>
+        <w:t xml:space="preserve">Y leyes ellos no tienen, ni plaza en la que se decide,</w:t>
+      </w:r>
+      <w:r>
+        <w:br/>
+      </w:r>
+      <w:r>
+        <w:t xml:space="preserve">que es en las crestas de altas montañas en donde viven</w:t>
+      </w:r>
+      <w:r>
+        <w:br/>
+      </w:r>
+      <w:r>
+        <w:t xml:space="preserve">dentro de cuéncavas grutas; cada uno sus leyes prescribe</w:t>
+      </w:r>
+      <w:r>
+        <w:br/>
+      </w:r>
+      <w:r>
+        <w:t xml:space="preserve">para sus hijos y esposas, sin que unos de otros se cuiden.</w:t>
       </w:r>
     </w:p>
     <w:p>
@@ -249,75 +166,45 @@
         <w:pStyle w:val="FirstParagraph"/>
       </w:pPr>
       <w:r>
-        <w:t xml:space="preserve">Por fin llegan a la isla de los Cíclopes, que resultan ser una panda de gandules, dándose la gran vida a expensas de los favores de los dioses:</w:t>
-      </w:r>
-    </w:p>
-    <w:p>
-      <w:pPr>
-        <w:pStyle w:val="BlockText"/>
-      </w:pPr>
-      <w:r>
-        <w:t xml:space="preserve">De allí otra vez navegamos con el corazón sombritriste,</w:t>
-      </w:r>
-      <w:r>
-        <w:br/>
-      </w:r>
-      <w:r>
-        <w:t xml:space="preserve">hasta que a patria de unos altivos sin ley, de los Cíclopes,</w:t>
-      </w:r>
-      <w:r>
-        <w:br/>
-      </w:r>
-      <w:r>
-        <w:t xml:space="preserve">fuimos a dar, que fiando ellos siempre en los dioses felices,</w:t>
-      </w:r>
-      <w:r>
-        <w:br/>
-      </w:r>
-      <w:r>
-        <w:t xml:space="preserve">ni aran la tierra ni siembran semilla que luego germine,</w:t>
-      </w:r>
-      <w:r>
-        <w:br/>
-      </w:r>
-      <w:r>
-        <w:t xml:space="preserve">pero sin siembra ni arada a ellos todo les nace y les rinde,</w:t>
-      </w:r>
-      <w:r>
-        <w:br/>
-      </w:r>
-      <w:r>
-        <w:t xml:space="preserve">los trigos y las cebadas y los racimos en vides</w:t>
-      </w:r>
-      <w:r>
-        <w:br/>
-      </w:r>
-      <w:r>
-        <w:t xml:space="preserve">llenos de vino que Zeus con su lluvia les infla y bendice.</w:t>
-      </w:r>
-      <w:r>
-        <w:br/>
-      </w:r>
-      <w:r>
-        <w:t xml:space="preserve">Y leyes ellos no tienen, ni plaza en la que se decide,</w:t>
-      </w:r>
-      <w:r>
-        <w:br/>
-      </w:r>
-      <w:r>
-        <w:t xml:space="preserve">que es en las crestas de altas montañas en donde viven</w:t>
-      </w:r>
-      <w:r>
-        <w:br/>
-      </w:r>
-      <w:r>
-        <w:t xml:space="preserve">dentro de cuéncavas grutas; cada uno sus leyes prescribe</w:t>
-      </w:r>
-      <w:r>
-        <w:br/>
-      </w:r>
-      <w:r>
-        <w:t xml:space="preserve">para sus hijos y esposas, sin que unos de otros se cuiden.</w:t>
+        <w:t xml:space="preserve">Unos «altivos sin ley» que fían en los dioses felices para que les llenen la despensa y la bota de vino, nada menos. ¿Y por qué? ¿Qué razones tienen los dioses para favorecerlos? Homero no lo explica, pero más tarde el anciano Ulises aventurará una respuesta. Por el momento, sin embargo, el aventurero que acaba de pegarle fuego a la ciudad de los cícones se dispone a ver qué puede saquear aquí.</w:t>
+      </w:r>
+    </w:p>
+    <w:p>
+      <w:pPr>
+        <w:pStyle w:val="BlockText"/>
+      </w:pPr>
+      <w:r>
+        <w:t xml:space="preserve">A un lado y fuera del puerto hay una isla pequeña, alargada,</w:t>
+      </w:r>
+      <w:r>
+        <w:br/>
+      </w:r>
+      <w:r>
+        <w:t xml:space="preserve">que del país de los Cíclopes cerca no está ni apartada,</w:t>
+      </w:r>
+      <w:r>
+        <w:br/>
+      </w:r>
+      <w:r>
+        <w:t xml:space="preserve">y es toda bosque; por ella salvajes se mueven las cabras</w:t>
+      </w:r>
+      <w:r>
+        <w:br/>
+      </w:r>
+      <w:r>
+        <w:t xml:space="preserve">innumerables, pues no las ahuyentan veredas humanas</w:t>
+      </w:r>
+      <w:r>
+        <w:br/>
+      </w:r>
+      <w:r>
+        <w:t xml:space="preserve">ni entran allí cazadores que ronden a la emboscada</w:t>
+      </w:r>
+      <w:r>
+        <w:br/>
+      </w:r>
+      <w:r>
+        <w:t xml:space="preserve">y se castiguen siguiéndoles rastro, alto allá en la montaña.</w:t>
       </w:r>
     </w:p>
     <w:p>
@@ -325,45 +212,69 @@
         <w:pStyle w:val="FirstParagraph"/>
       </w:pPr>
       <w:r>
-        <w:t xml:space="preserve">Unos «altivos sin ley» que fían en los dioses felices para que les llenen la despensa y la bota de vino, nada menos. ¿Y por qué? ¿Qué razones tienen los dioses para favorecerlos? Homero no lo explica, pero más tarde el anciano Ulises aventurará una respuesta. Por el momento, sin embargo, el aventurero que acaba de pegarle fuego a la ciudad de los cícones se dispone a ver qué puede saquear aquí.</w:t>
-      </w:r>
-    </w:p>
-    <w:p>
-      <w:pPr>
-        <w:pStyle w:val="BlockText"/>
-      </w:pPr>
-      <w:r>
-        <w:t xml:space="preserve">A un lado y fuera del puerto hay una isla pequeña, alargada,</w:t>
-      </w:r>
-      <w:r>
-        <w:br/>
-      </w:r>
-      <w:r>
-        <w:t xml:space="preserve">que del país de los Cíclopes cerca no está ni apartada,</w:t>
-      </w:r>
-      <w:r>
-        <w:br/>
-      </w:r>
-      <w:r>
-        <w:t xml:space="preserve">y es toda bosque; por ella salvajes se mueven las cabras</w:t>
-      </w:r>
-      <w:r>
-        <w:br/>
-      </w:r>
-      <w:r>
-        <w:t xml:space="preserve">innumerables, pues no las ahuyentan veredas humanas</w:t>
-      </w:r>
-      <w:r>
-        <w:br/>
-      </w:r>
-      <w:r>
-        <w:t xml:space="preserve">ni entran allí cazadores que ronden a la emboscada</w:t>
-      </w:r>
-      <w:r>
-        <w:br/>
-      </w:r>
-      <w:r>
-        <w:t xml:space="preserve">y se castiguen siguiéndoles rastro, alto allá en la montaña.</w:t>
+        <w:t xml:space="preserve">Ulises cuenta que sus naves embarrancan, con fortuna, en las playas de la isla:</w:t>
+      </w:r>
+    </w:p>
+    <w:p>
+      <w:pPr>
+        <w:pStyle w:val="BlockText"/>
+      </w:pPr>
+      <w:r>
+        <w:t xml:space="preserve">Allí, pues, fueron las naves, y a fe que algún dios nos guiaba</w:t>
+      </w:r>
+      <w:r>
+        <w:br/>
+      </w:r>
+      <w:r>
+        <w:t xml:space="preserve">esa negrísima noche, que a ver nada allí se nos daba.</w:t>
+      </w:r>
+      <w:r>
+        <w:br/>
+      </w:r>
+      <w:r>
+        <w:t xml:space="preserve">Solo una niebla cerrada en redor, y ni luna asomaba</w:t>
+      </w:r>
+      <w:r>
+        <w:br/>
+      </w:r>
+      <w:r>
+        <w:t xml:space="preserve">para nosotros del cielo, las nubes no la dejaban.</w:t>
+      </w:r>
+      <w:r>
+        <w:br/>
+      </w:r>
+      <w:r>
+        <w:t xml:space="preserve">Nadie la isla allí vio con sus ojos, ni vimos las largas</w:t>
+      </w:r>
+      <w:r>
+        <w:br/>
+      </w:r>
+      <w:r>
+        <w:t xml:space="preserve">olas tampoco rodar a lo largo por sobre la playa</w:t>
+      </w:r>
+      <w:r>
+        <w:br/>
+      </w:r>
+      <w:r>
+        <w:t xml:space="preserve">hasta que en tierra encallamos las naves bellibancadas.</w:t>
+      </w:r>
+      <w:r>
+        <w:br/>
+      </w:r>
+      <w:r>
+        <w:t xml:space="preserve">Ellas varadas, echamos las velas abajo a las tablas</w:t>
+      </w:r>
+      <w:r>
+        <w:br/>
+      </w:r>
+      <w:r>
+        <w:t xml:space="preserve">y al fin nos desembarcamos sobre el arenal de las aguas.</w:t>
+      </w:r>
+      <w:r>
+        <w:br/>
+      </w:r>
+      <w:r>
+        <w:t xml:space="preserve">Nos entregamos al sueño allí hasta las claras del alba.</w:t>
       </w:r>
     </w:p>
     <w:p>
@@ -371,69 +282,122 @@
         <w:pStyle w:val="FirstParagraph"/>
       </w:pPr>
       <w:r>
-        <w:t xml:space="preserve">Ulises cuenta que sus naves embarrancan, con fortuna, en las playas de la isla:</w:t>
-      </w:r>
-    </w:p>
-    <w:p>
-      <w:pPr>
-        <w:pStyle w:val="BlockText"/>
-      </w:pPr>
-      <w:r>
-        <w:t xml:space="preserve">Allí, pues, fueron las naves, y a fe que algún dios nos guiaba</w:t>
-      </w:r>
-      <w:r>
-        <w:br/>
-      </w:r>
-      <w:r>
-        <w:t xml:space="preserve">esa negrísima noche, que a ver nada allí se nos daba.</w:t>
-      </w:r>
-      <w:r>
-        <w:br/>
-      </w:r>
-      <w:r>
-        <w:t xml:space="preserve">Solo una niebla cerrada en redor, y ni luna asomaba</w:t>
-      </w:r>
-      <w:r>
-        <w:br/>
-      </w:r>
-      <w:r>
-        <w:t xml:space="preserve">para nosotros del cielo, las nubes no la dejaban.</w:t>
-      </w:r>
-      <w:r>
-        <w:br/>
-      </w:r>
-      <w:r>
-        <w:t xml:space="preserve">Nadie la isla allí vio con sus ojos, ni vimos las largas</w:t>
-      </w:r>
-      <w:r>
-        <w:br/>
-      </w:r>
-      <w:r>
-        <w:t xml:space="preserve">olas tampoco rodar a lo largo por sobre la playa</w:t>
-      </w:r>
-      <w:r>
-        <w:br/>
-      </w:r>
-      <w:r>
-        <w:t xml:space="preserve">hasta que en tierra encallamos las naves bellibancadas.</w:t>
-      </w:r>
-      <w:r>
-        <w:br/>
-      </w:r>
-      <w:r>
-        <w:t xml:space="preserve">Ellas varadas, echamos las velas abajo a las tablas</w:t>
-      </w:r>
-      <w:r>
-        <w:br/>
-      </w:r>
-      <w:r>
-        <w:t xml:space="preserve">y al fin nos desembarcamos sobre el arenal de las aguas.</w:t>
-      </w:r>
-      <w:r>
-        <w:br/>
-      </w:r>
-      <w:r>
-        <w:t xml:space="preserve">Nos entregamos al sueño allí hasta las claras del alba.</w:t>
+        <w:t xml:space="preserve">Y al despertarse, los aqueos se encuentran el festín servido, como quien dice:</w:t>
+      </w:r>
+    </w:p>
+    <w:p>
+      <w:pPr>
+        <w:pStyle w:val="BlockText"/>
+      </w:pPr>
+      <w:r>
+        <w:t xml:space="preserve">Cuando sus dedos de rosa la Aurora asomó tempranera,</w:t>
+      </w:r>
+      <w:r>
+        <w:br/>
+      </w:r>
+      <w:r>
+        <w:t xml:space="preserve">fuimos a andar por la isla, mirándolo todo en sorpresa.</w:t>
+      </w:r>
+      <w:r>
+        <w:br/>
+      </w:r>
+      <w:r>
+        <w:t xml:space="preserve">Las ninfas, hijas de Zeus cabrillante, al pasar nos ojean</w:t>
+      </w:r>
+      <w:r>
+        <w:br/>
+      </w:r>
+      <w:r>
+        <w:t xml:space="preserve">cabras montesas, y a bien, por aviarle a mi gente la cena.</w:t>
+      </w:r>
+      <w:r>
+        <w:br/>
+      </w:r>
+      <w:r>
+        <w:t xml:space="preserve">Y ya los arcos recorvos y las azagayas punteras</w:t>
+      </w:r>
+      <w:r>
+        <w:br/>
+      </w:r>
+      <w:r>
+        <w:t xml:space="preserve">de nuestros barcos sacamos, y en tres dividimos las fuerzas</w:t>
+      </w:r>
+      <w:r>
+        <w:br/>
+      </w:r>
+      <w:r>
+        <w:t xml:space="preserve">y disparamos; y a gana y contento nos dio un dios las presas.</w:t>
+      </w:r>
+      <w:r>
+        <w:br/>
+      </w:r>
+    </w:p>
+    <w:p>
+      <w:pPr>
+        <w:pStyle w:val="BlockText"/>
+      </w:pPr>
+      <w:r>
+        <w:t xml:space="preserve">Doce las naves conmigo; tocaron cada una de ellas</w:t>
+      </w:r>
+      <w:r>
+        <w:br/>
+      </w:r>
+      <w:r>
+        <w:t xml:space="preserve">a nueve cabras, y diez me apartaron a mí en preferencia.</w:t>
+      </w:r>
+      <w:r>
+        <w:br/>
+      </w:r>
+      <w:r>
+        <w:t xml:space="preserve">Fue así un estar todo el día, hasta hundirse ya el sol, como en fiesta</w:t>
+      </w:r>
+      <w:r>
+        <w:br/>
+      </w:r>
+      <w:r>
+        <w:t xml:space="preserve">saboreando con muy dulce vino tasajos a espuertas;</w:t>
+      </w:r>
+      <w:r>
+        <w:br/>
+      </w:r>
+      <w:r>
+        <w:t xml:space="preserve">que no se había agotado el tinto de nuestras bodegas,</w:t>
+      </w:r>
+      <w:r>
+        <w:br/>
+      </w:r>
+      <w:r>
+        <w:t xml:space="preserve">que aún nos quedaba del que trasvasamos en ánforas llenas</w:t>
+      </w:r>
+      <w:r>
+        <w:br/>
+      </w:r>
+      <w:r>
+        <w:t xml:space="preserve">cuando la santa ciudad de los cícones plaza fue nuestra.</w:t>
+      </w:r>
+      <w:r>
+        <w:br/>
+      </w:r>
+      <w:r>
+        <w:t xml:space="preserve">Viendo allí estábamos tierra de Cíclopes —era bien cerca—</w:t>
+      </w:r>
+      <w:r>
+        <w:br/>
+      </w:r>
+      <w:r>
+        <w:t xml:space="preserve">y humo, y sintiendo sus voces, y las de sus cabras y ovejas.</w:t>
+      </w:r>
+      <w:r>
+        <w:br/>
+      </w:r>
+      <w:r>
+        <w:t xml:space="preserve">Y cuando el sol se hundió y vino a caer la tiniebla,</w:t>
+      </w:r>
+      <w:r>
+        <w:br/>
+      </w:r>
+      <w:r>
+        <w:t xml:space="preserve">allí a dormir nos tendimos al borde del mar por la arena.</w:t>
       </w:r>
     </w:p>
     <w:p>
@@ -441,7 +405,7 @@
         <w:pStyle w:val="FirstParagraph"/>
       </w:pPr>
       <w:r>
-        <w:t xml:space="preserve">Y al despertarse, los aqueos se encuentran el festín servido, como quien dice:</w:t>
+        <w:t xml:space="preserve">No pueden quejarse: se han dado un festín y han repuesto fuerzas. La prudencia aconsejaría seguir camino. Pero Ulises no sería Ulises si no fuera curioso (y rapaz) y al día siguiente decide explorar, a ver si puede llevarse algo más:</w:t>
       </w:r>
     </w:p>
     <w:p>
@@ -455,103 +419,37 @@
         <w:br/>
       </w:r>
       <w:r>
-        <w:t xml:space="preserve">fuimos a andar por la isla, mirándolo todo en sorpresa.</w:t>
-      </w:r>
-      <w:r>
-        <w:br/>
-      </w:r>
-      <w:r>
-        <w:t xml:space="preserve">Las ninfas, hijas de Zeus cabrillante, al pasar nos ojean</w:t>
-      </w:r>
-      <w:r>
-        <w:br/>
-      </w:r>
-      <w:r>
-        <w:t xml:space="preserve">cabras montesas, y a bien, por aviarle a mi gente la cena.</w:t>
-      </w:r>
-      <w:r>
-        <w:br/>
-      </w:r>
-      <w:r>
-        <w:t xml:space="preserve">Y ya los arcos recorvos y las azagayas punteras</w:t>
-      </w:r>
-      <w:r>
-        <w:br/>
-      </w:r>
-      <w:r>
-        <w:t xml:space="preserve">de nuestros barcos sacamos, y en tres dividimos las fuerzas</w:t>
-      </w:r>
-      <w:r>
-        <w:br/>
-      </w:r>
-      <w:r>
-        <w:t xml:space="preserve">y disparamos; y a gana y contento nos dio un dios las presas.</w:t>
-      </w:r>
-      <w:r>
-        <w:br/>
-      </w:r>
-      <w:r>
-        <w:t xml:space="preserve">Doce las naves conmigo; tocaron cada una de ellas</w:t>
-      </w:r>
-      <w:r>
-        <w:br/>
-      </w:r>
-      <w:r>
-        <w:t xml:space="preserve">a nueve cabras, y diez me apartaron a mí en preferencia.</w:t>
-      </w:r>
-      <w:r>
-        <w:br/>
-      </w:r>
-      <w:r>
-        <w:t xml:space="preserve">Fue así un estar todo el día, hasta hundirse ya el sol, como en fiesta</w:t>
-      </w:r>
-      <w:r>
-        <w:br/>
-      </w:r>
-      <w:r>
-        <w:t xml:space="preserve">saboreando con muy dulce vino tasajos a espuertas;</w:t>
-      </w:r>
-      <w:r>
-        <w:br/>
-      </w:r>
-      <w:r>
-        <w:t xml:space="preserve">que no se había agotado el tinto de nuestras bodegas,</w:t>
-      </w:r>
-      <w:r>
-        <w:br/>
-      </w:r>
-      <w:r>
-        <w:t xml:space="preserve">que aún nos quedaba del que trasvasamos en ánforas llenas</w:t>
-      </w:r>
-      <w:r>
-        <w:br/>
-      </w:r>
-      <w:r>
-        <w:t xml:space="preserve">cuando la santa ciudad de los cícones plaza fue nuestra.</w:t>
-      </w:r>
-      <w:r>
-        <w:br/>
-      </w:r>
-      <w:r>
-        <w:t xml:space="preserve">Viendo allí estábamos tierra de Cíclopes —era bien cerca—</w:t>
-      </w:r>
-      <w:r>
-        <w:br/>
-      </w:r>
-      <w:r>
-        <w:t xml:space="preserve">y humo, y sintiendo sus voces, y las de sus cabras y ovejas.</w:t>
-      </w:r>
-      <w:r>
-        <w:br/>
-      </w:r>
-      <w:r>
-        <w:t xml:space="preserve">Y cuando el sol se hundió y vino a caer la tiniebla,</w:t>
-      </w:r>
-      <w:r>
-        <w:br/>
-      </w:r>
-      <w:r>
-        <w:t xml:space="preserve">allí a dormir nos tendimos al borde del mar por la arena.</w:t>
+        <w:t xml:space="preserve">los reuní y para todos hablé porque todos me oyeran:</w:t>
+      </w:r>
+      <w:r>
+        <w:br/>
+      </w:r>
+      <w:r>
+        <w:t xml:space="preserve">«Ahora quedaos, mis fieles, aquí sin moveros del sitio;</w:t>
+      </w:r>
+      <w:r>
+        <w:br/>
+      </w:r>
+      <w:r>
+        <w:t xml:space="preserve">que yo me voy a acercar con mi nave y mi marinerío</w:t>
+      </w:r>
+      <w:r>
+        <w:br/>
+      </w:r>
+      <w:r>
+        <w:t xml:space="preserve">para saber de esos hombres y ver quiénes son, de cuál signo,</w:t>
+      </w:r>
+      <w:r>
+        <w:br/>
+      </w:r>
+      <w:r>
+        <w:t xml:space="preserve">si son soberbios, brutales y de la justicia no amigos,</w:t>
+      </w:r>
+      <w:r>
+        <w:br/>
+      </w:r>
+      <w:r>
+        <w:t xml:space="preserve">o acogedores y bien temerosos del cielo en su espíritu».</w:t>
       </w:r>
     </w:p>
     <w:p>
@@ -559,51 +457,87 @@
         <w:pStyle w:val="FirstParagraph"/>
       </w:pPr>
       <w:r>
-        <w:t xml:space="preserve">No pueden quejarse: se han dado un festín y han repuesto fuerzas. La prudencia aconsejaría seguir camino. Pero Ulises no sería Ulises si no fuera curioso (y rapaz) y al día siguiente decide explorar, a ver si puede llevarse algo más:</w:t>
-      </w:r>
-    </w:p>
-    <w:p>
-      <w:pPr>
-        <w:pStyle w:val="BlockText"/>
-      </w:pPr>
-      <w:r>
-        <w:t xml:space="preserve">Cuando sus dedos de rosa la Aurora asomó tempranera,</w:t>
-      </w:r>
-      <w:r>
-        <w:br/>
-      </w:r>
-      <w:r>
-        <w:t xml:space="preserve">los reuní y para todos hablé porque todos me oyeran:</w:t>
-      </w:r>
-      <w:r>
-        <w:br/>
-      </w:r>
-      <w:r>
-        <w:t xml:space="preserve">«Ahora quedaos, mis fieles, aquí sin moveros del sitio;</w:t>
-      </w:r>
-      <w:r>
-        <w:br/>
-      </w:r>
-      <w:r>
-        <w:t xml:space="preserve">que yo me voy a acercar con mi nave y mi marinerío</w:t>
-      </w:r>
-      <w:r>
-        <w:br/>
-      </w:r>
-      <w:r>
-        <w:t xml:space="preserve">para saber de esos hombres y ver quiénes son, de cuál signo,</w:t>
-      </w:r>
-      <w:r>
-        <w:br/>
-      </w:r>
-      <w:r>
-        <w:t xml:space="preserve">si son soberbios, brutales y de la justicia no amigos,</w:t>
-      </w:r>
-      <w:r>
-        <w:br/>
-      </w:r>
-      <w:r>
-        <w:t xml:space="preserve">o acogedores y bien temerosos del cielo en su espíritu».</w:t>
+        <w:t xml:space="preserve">Ya le vale, al saqueador de ciudades, ponerse tan estupendo con los habitantes de la isla, que a duras penas van a resultar más «soberbios, brutales y de la justicia no amigos» que él y su tripulación. Pero si los dioses pueden permitirse una doble moral, tampoco se la niega Homero a nuestro héroe milmañas:</w:t>
+      </w:r>
+    </w:p>
+    <w:p>
+      <w:pPr>
+        <w:pStyle w:val="BlockText"/>
+      </w:pPr>
+      <w:r>
+        <w:t xml:space="preserve">Esto diciendo, subí yo a la nave, ordenando a mi tropa</w:t>
+      </w:r>
+      <w:r>
+        <w:br/>
+      </w:r>
+      <w:r>
+        <w:t xml:space="preserve">que se embarcara también y soltara los cables de popa.</w:t>
+      </w:r>
+      <w:r>
+        <w:br/>
+      </w:r>
+      <w:r>
+        <w:t xml:space="preserve">Y a esa mi voz embarcaron y junto a los remos se apostan,</w:t>
+      </w:r>
+      <w:r>
+        <w:br/>
+      </w:r>
+      <w:r>
+        <w:t xml:space="preserve">y, uno tras otro sentados, golpeaban la mar canizosa.</w:t>
+      </w:r>
+      <w:r>
+        <w:br/>
+      </w:r>
+      <w:r>
+        <w:t xml:space="preserve">En cuanto a aquella región arribamos —se hallaba muy próxima—,</w:t>
+      </w:r>
+      <w:r>
+        <w:br/>
+      </w:r>
+      <w:r>
+        <w:t xml:space="preserve">vimos allá, en un extremo, una cueva mirando a las olas</w:t>
+      </w:r>
+      <w:r>
+        <w:br/>
+      </w:r>
+      <w:r>
+        <w:t xml:space="preserve">bien en lo alto, y envuelta en laureles. De noche era choza</w:t>
+      </w:r>
+      <w:r>
+        <w:br/>
+      </w:r>
+      <w:r>
+        <w:t xml:space="preserve">de un apretado rebaño de cabras y ovejas; de rocas</w:t>
+      </w:r>
+      <w:r>
+        <w:br/>
+      </w:r>
+      <w:r>
+        <w:t xml:space="preserve">bien incrustadas en tierra se alzaba una cerca a redonda,</w:t>
+      </w:r>
+      <w:r>
+        <w:br/>
+      </w:r>
+      <w:r>
+        <w:t xml:space="preserve">con largos pinos entre ellas y encinas altifrondosas.</w:t>
+      </w:r>
+      <w:r>
+        <w:br/>
+      </w:r>
+      <w:r>
+        <w:t xml:space="preserve">De noche allí se encovaba un hombre gigante, que, a solas,</w:t>
+      </w:r>
+      <w:r>
+        <w:br/>
+      </w:r>
+      <w:r>
+        <w:t xml:space="preserve">apacentaba sus hatos aparte, sin ver a persona, y</w:t>
+      </w:r>
+      <w:r>
+        <w:br/>
+      </w:r>
+      <w:r>
+        <w:t xml:space="preserve">lejos, muy lejos de todos, vivía ignorante de normas.</w:t>
       </w:r>
     </w:p>
     <w:p>
@@ -611,101 +545,13 @@
         <w:pStyle w:val="FirstParagraph"/>
       </w:pPr>
       <w:r>
-        <w:t xml:space="preserve">Ya le vale, al saqueador de ciudades, ponerse tan estupendo con los habitantes de la isla, que a duras penas van a resultar más «soberbios, brutales y de la justicia no amigos» que él y su tripulación. Pero si los dioses pueden permitirse una doble moral, tampoco se la niega Homero a nuestro héroe milmañas:</w:t>
-      </w:r>
-    </w:p>
-    <w:p>
-      <w:pPr>
-        <w:pStyle w:val="BlockText"/>
-      </w:pPr>
-      <w:r>
-        <w:t xml:space="preserve">Esto diciendo, subí yo a la nave, ordenando a mi tropa</w:t>
-      </w:r>
-      <w:r>
-        <w:br/>
-      </w:r>
-      <w:r>
-        <w:t xml:space="preserve">que se embarcara también y soltara los cables de popa.</w:t>
-      </w:r>
-      <w:r>
-        <w:br/>
-      </w:r>
-      <w:r>
-        <w:t xml:space="preserve">Y a esa mi voz embarcaron y junto a los remos se apostan,</w:t>
-      </w:r>
-      <w:r>
-        <w:br/>
-      </w:r>
-      <w:r>
-        <w:t xml:space="preserve">y, uno tras otro sentados, golpeaban la mar canizosa.</w:t>
-      </w:r>
-      <w:r>
-        <w:br/>
-      </w:r>
-      <w:r>
-        <w:t xml:space="preserve">En cuanto a aquella región arribamos —se hallaba muy próxima—,</w:t>
-      </w:r>
-      <w:r>
-        <w:br/>
-      </w:r>
-      <w:r>
-        <w:t xml:space="preserve">vimos allá, en un extremo, una cueva mirando a las olas</w:t>
-      </w:r>
-      <w:r>
-        <w:br/>
-      </w:r>
-      <w:r>
-        <w:t xml:space="preserve">bien en lo alto, y envuelta en laureles. De noche era choza</w:t>
-      </w:r>
-      <w:r>
-        <w:br/>
-      </w:r>
-      <w:r>
-        <w:t xml:space="preserve">de un apretado rebaño de cabras y ovejas; de rocas</w:t>
-      </w:r>
-      <w:r>
-        <w:br/>
-      </w:r>
-      <w:r>
-        <w:t xml:space="preserve">bien incrustadas en tierra se alzaba una cerca a redonda,</w:t>
-      </w:r>
-      <w:r>
-        <w:br/>
-      </w:r>
-      <w:r>
-        <w:t xml:space="preserve">con largos pinos entre ellas y encinas altifrondosas.</w:t>
-      </w:r>
-      <w:r>
-        <w:br/>
-      </w:r>
-      <w:r>
-        <w:t xml:space="preserve">De noche allí se encovaba un hombre gigante, que, a solas,</w:t>
-      </w:r>
-      <w:r>
-        <w:br/>
-      </w:r>
-      <w:r>
-        <w:t xml:space="preserve">apacentaba sus hatos aparte, sin ver a persona, y</w:t>
-      </w:r>
-      <w:r>
-        <w:br/>
-      </w:r>
-      <w:r>
-        <w:t xml:space="preserve">lejos, muy lejos de todos, vivía ignorante de normas.</w:t>
-      </w:r>
-    </w:p>
-    <w:p>
-      <w:pPr>
-        <w:pStyle w:val="FirstParagraph"/>
-      </w:pPr>
-      <w:r>
-        <w:t xml:space="preserve">A Homero le encantan los paralelismos. Hemos visto ya varios y veremos más. Aquí hay uno que salta a la vista. Calipso y el Cíclope viven ambos en cuevas, lo que sugiere, dicho sea de paso, que el Poeta no está dando a entender que ese tipo de morada corresponda a un habitante rudo o miserable, sino, quizás, a un ser con ciertos atributos sobrenaturales. Tampoco dice que el Cíclope sea un monstruo, ni que tenga un solo ojo</w:t>
+        <w:t xml:space="preserve">A Homero le encantan los paralelismos. Hemos visto ya varios y veremos más. Aquí hay uno que salta a la vista. Calipso y el Cíclope viven ambos en cuevas, lo que sugiere, dicho sea de paso, que el Poeta no está dando a entender que ese tipo de morada corresponda a un habitante rudo o primitivo, sino, quizás, a un ser con ciertos atributos sobrenaturales. Tampoco dice que el Cíclope sea un monstruo, ni que tenga un solo ojo</w:t>
       </w:r>
       <w:r>
         <w:rPr>
           <w:rStyle w:val="FootnoteReference"/>
         </w:rPr>
-        <w:footnoteReference w:id="9"/>
+        <w:footnoteReference w:id="10"/>
       </w:r>
       <w:r>
         <w:t xml:space="preserve">. Eso sí, nos avisa de que es un gigante, y nada le da pie a pensar que vaya a recibirlos amablemente, a pesar de lo cual Odiseo sigue empeñado en la visita:</w:t>
@@ -955,7 +801,7 @@
         <w:pStyle w:val="FirstParagraph"/>
       </w:pPr>
       <w:r>
-        <w:t xml:space="preserve">¡Et voilà! Para los estándares de la época, Polifemo vive en la cueva del tesoro, que Homero nos describe con todo detalle. Quesos, chivos, borregos, cántaros de leche. Los hombres que ha traído consigo, sensatamente, proponen hacerse con unos quesos y salir por piernas antes de que llegue el gigante. Pero Ulises, haciendo gala de valentía —pero también de una imprudencia infantil, vista la talla del cíclope, y de una arrogancia que le impide pensar en su tripulación— insiste en quedarse, mitad por curiosidad, mitad por avaricia («Ah, pero yo no hice caso —¡y cuánto mejor haberlo hecho!— por verlo a él y, quizás, por ganar, como huésped, su obsequio»).</w:t>
+        <w:t xml:space="preserve">¡Et voilà! Para los estándares de la época, Polifemo vive en la cueva del tesoro, que Homero nos describe con todo detalle. Quesos, chivos, borregos, cántaros de leche. Los hombres que ha traído consigo, sensatamente, proponen hacerse con unas viandas y salir por piernas antes de que llegue el gigante. Pero Ulises, haciendo gala de valentía —pero también de una imprudencia infantil, vista la talla del cíclope, y de una arrogancia que le impide pensar en su tripulación— insiste en quedarse, mitad por curiosidad, mitad por avaricia («Ah, pero yo no hice caso —¡y cuánto mejor haberlo hecho!— por verlo a él y, quizás, por ganar, como huésped, su obsequio»).</w:t>
       </w:r>
     </w:p>
     <w:p>
@@ -1230,7 +1076,7 @@
         <w:t xml:space="preserve"> </w:t>
       </w:r>
       <w:r>
-        <w:t xml:space="preserve">por «huéspedes» en casa de Néstor y por «extraños» en la cueva del cíclope. Se da el caso de que ambas traducciones son correctas: en griego clásico, «huésped» y «extraño» son la misma palabra. Pero Tobal puede permitirse remarcar el carácter de «invitados» en casa de Néstor, en contraposición con el de «extraños» en la cueva del cíclope, de connotación mucho más hostil. Más importante, Néstor pregunta quiénes son a sus invitados después de darles de comer, es decir, después de haberles demostrado hospitalidad. El cíclope lo hace inmediatamente, lo que no augura nada bueno. Los aqueos, con razón, se mueren de miedo, pero Ulises no pierde la calma:</w:t>
+        <w:t xml:space="preserve">por «huéspedes» en casa de Néstor y por «extraños» en la cueva del cíclope. Se da el caso de que ambas traducciones son correctas: en griego clásico, «huésped» y «extraño» son la misma palabra. Pero Tobal puede permitirse remarcar el carácter de «invitados» en casa de Néstor, en contraposición con el de «extraños» en la cueva del cíclope, de connotación mucho más hostil. Y otro detalle, Néstor pregunta quiénes son a sus invitados después de darles de comer, es decir, después de haberles demostrado hospitalidad. El cíclope lo hace inmediatamente, lo que no augura nada bueno. Los aqueos, con razón, se mueren de miedo, pero Ulises no pierde la calma:</w:t>
       </w:r>
     </w:p>
     <w:p>
@@ -1438,7 +1284,15 @@
         <w:t xml:space="preserve">xenía</w:t>
       </w:r>
       <w:r>
-        <w:t xml:space="preserve">, pero si examinamos con cierta atención sus argumentos, veremos que están sujetos con pinzas. Muy cierto, el caballo de Troya fue una treta astuta y no poco vil, pero después de todo los troyanos y los aqueos estaban en guerra y nadie les mandaba a los de Ilión meter el equinomaderoso en su alcázar y acostarse a dormir tan campantes. No hay en esa situación un extranjero que pide hospitalidad y un anfitrión que se la niega. Y de hecho, si leemos atentamente la</w:t>
+        <w:t xml:space="preserve">, pero el único ejemplo sustancial que nos da —la treta del caballo— resulta, como hemos visto, bastante endeble. Si examinamos con cierta atención sus argumentos, veremos que apenas se sostienen.</w:t>
+      </w:r>
+    </w:p>
+    <w:p>
+      <w:pPr>
+        <w:pStyle w:val="BodyText"/>
+      </w:pPr>
+      <w:r>
+        <w:t xml:space="preserve">De hecho, si leemos atentamente la</w:t>
       </w:r>
       <w:r>
         <w:t xml:space="preserve"> </w:t>
@@ -1464,7 +1318,7 @@
         <w:t xml:space="preserve">xenía</w:t>
       </w:r>
       <w:r>
-        <w:t xml:space="preserve">, como también lo hace Calipso y, si me apuras, Circe, aunque a la hechicera trenzadivina hay que echarle de comer aparte. Y por supuesto, los feacios se definen como la encarnación misma de la hospitalidad. Los dos ejemplos en los que la</w:t>
+        <w:t xml:space="preserve">, como también lo hace Calipso y, cerdo arriba, cerdo abajo, también Circe. Y por supuesto, los feacios se definen como la encarnación misma de la hospitalidad. Los dos ejemplos en los que la</w:t>
       </w:r>
       <w:r>
         <w:t xml:space="preserve"> </w:t>
@@ -1493,7 +1347,7 @@
         <w:t xml:space="preserve">Odisea</w:t>
       </w:r>
       <w:r>
-        <w:t xml:space="preserve">, ignora el mejor ejemplo en el que esta se viola de manera racional y consciente. El problema del cíclope de Nolan es que es un pobre hombre, un simple, que se come a los aqueos como quien se come una sardina en escabeche, sin darle, aparentemente, importancia al hecho, mientras que el Polifemo de Odiseo es artero, cruel, arrogante... Y astuto. Fijémonos en su última pregunta. «Por curiosidad, ¿dónde has dejado tus naves?». No solo piensa comerse a los rehenes que tiene encerrados en su cueva, sino que pretende enterarse de dónde está el resto de la tripulación y con seguridad que no es para hacerles una visita de cortesía.</w:t>
+        <w:t xml:space="preserve">, ignora el mejor ejemplo en el que esta se viola de manera racional y consciente. El problema del cíclope de Nolan es que es un pobre hombre, un simple, que se zampa a los aqueos como quien se merienda sardinas, sin darle, aparentemente, importancia al hecho, mientras que el Polifemo de Odiseo es artero, cruel, arrogante... Y astuto. Fijémonos en su última pregunta. «Por curiosidad, ¿dónde has dejado tus naves?». No solo piensa comerse a los rehenes que tiene encerrados en su cueva, sino que pretende enterarse de dónde está el resto de la tripulación y con seguridad que no es para hacerles una visita de cortesía.</w:t>
       </w:r>
     </w:p>
     <w:p>
@@ -1501,7 +1355,7 @@
         <w:pStyle w:val="BodyText"/>
       </w:pPr>
       <w:r>
-        <w:t xml:space="preserve">Y aquí se repite otro patrón que ya conocemos, el del enfrentamiento entre dos enemigos inteligentes y arteros. Ulises ya se las había visto con las mañas de Helena en Troya y ahora le toca responder a los ardides de Polifemo. Y si en Ilión sale victorioso usando la resistencia pasiva —negándose a caer en la trampa de Helena y guardando silencio—, en la cueva del cíclope el mientisagaz da con la mayor de todas sus célebres tretas. Responde:</w:t>
+        <w:t xml:space="preserve">Y aquí se repite otro patrón que ya conocemos, el del enfrentamiento entre dos enemigos inteligentes y astutos. Ulises ya se las había visto con las mañas de Helena en Troya y ahora le toca responder a los ardides de Polifemo. Y si en Ilión sale victorioso usando la resistencia pasiva —negándose a caer en la trampa de Helena y guardando silencio—, en la cueva del cíclope el mientisagaz da con la mayor de todas sus célebres tretas. Responde:</w:t>
       </w:r>
     </w:p>
     <w:p>
@@ -1709,7 +1563,7 @@
         <w:pStyle w:val="FirstParagraph"/>
       </w:pPr>
       <w:r>
-        <w:t xml:space="preserve">Otro detalle impresionante es el hecho de que el cruel Polifemo trata con mimo exquisito a sus ovejas. Quizás, después de todo, no es que Polifemo sea un monstruo, sino que, en su escala de valores, las vidas de los aqueos no valen nada. ¿Tiene Ulises derecho a quejarse de semejante trato después de haber arrasado Ilión? Pero claro, Ulises no se queda en la cueva ponderando la relatividad del bien y el mal, sino tramando venganzas. Y aquí viene la famosa escena del madero puntiforme.</w:t>
+        <w:t xml:space="preserve">Otro detalle impresionante es el hecho de que el cruel Polifemo trata con mimo exquisito a sus ovejas. Quizás, después de todo, no es que el cíclope sea un monstruo, sino que, en su escala de valores, las vidas de los aqueos no valen nada. ¿Tiene Ulises derecho a quejarse de semejante trato después de haber arrasado Ilión? Pero claro, el de Laertes no se queda en la cueva ponderando la relatividad del bien y el mal, sino tramando venganzas. Y aquí viene la famosa escena del madero puntiforme.</w:t>
       </w:r>
     </w:p>
     <w:p>
@@ -1989,7 +1843,7 @@
         <w:pStyle w:val="FirstParagraph"/>
       </w:pPr>
       <w:r>
-        <w:t xml:space="preserve">Le pide el nombre a cambio de un prometido regalo. La burla no puede ser más descarada. Los feacios solo preguntarán por el nombre del héroe después de colmarlo de regalos y queda muy claro aquí que poco puede esperarse de la generosidad de este truhan comehombres. Pero Odiseo lleva un as en la manga. Acaba de emborracharlo y luego le dice cómo se llama:</w:t>
+        <w:t xml:space="preserve">Le pide el nombre a cambio de un prometido regalo. La burla no puede ser más descarada. Los feacios solo preguntarán por el nombre del héroe después de colmarlo de regalos y queda muy claro aquí que poco puede esperarse de la generosidad de este truhan come hombres. Pero Odiseo lleva un as en la manga. Acaba de emborracharlo y luego le dice cómo se llama:</w:t>
       </w:r>
     </w:p>
     <w:p>
@@ -2098,7 +1952,7 @@
         <w:rPr>
           <w:rStyle w:val="FootnoteReference"/>
         </w:rPr>
-        <w:footnoteReference w:id="10"/>
+        <w:footnoteReference w:id="11"/>
       </w:r>
       <w:r>
         <w:t xml:space="preserve">. Una vez más, la precisión narrativa del Poeta es espeluznante:</w:t>
@@ -2189,7 +2043,7 @@
         <w:pStyle w:val="FirstParagraph"/>
       </w:pPr>
       <w:r>
-        <w:t xml:space="preserve">Dudo que Flaubert fuera capaz de escribir un párrafo más preciso y más terrorífico. Polifemo se retuerce de dolor y llama, gimiendo, a los otros cíclopes —que no aparecen en la película de Nolan—. Sus paisanos se acercan y le preguntan desde fuera de la cueva:</w:t>
+        <w:t xml:space="preserve">Dudo que Flaubert fuera capaz de escribir un párrafo más preciso y más terrorífico. Polifemo se retuerce de dolor y llama, gimiendo, a los otros cíclopes. Sus paisanos se acercan y le preguntan desde fuera de la cueva:</w:t>
       </w:r>
     </w:p>
     <w:p>
@@ -2295,7 +2149,7 @@
         <w:pStyle w:val="FirstParagraph"/>
       </w:pPr>
       <w:r>
-        <w:t xml:space="preserve">El resto es cine. Polifemo retira la piedra, los aqueos se esconden entre las ovejas y se escapan de la cueva, llevándose de paso a los carneros. Han salido del apuro y todo lo que necesitan hacer ahora es salir por remos. Ah, pero Ulises no puede quedarse calladito, no puede soportar la idea de marcharse sin provocar a su enemigo:</w:t>
+        <w:t xml:space="preserve">El resto es cine. Polifemo retira la piedra, los aqueos se esconden entre las ovejas y se escapan de la cueva, llevándose de paso a los carneros. Han salido del apuro y todo lo que necesitan hacer ahora es salir por remos. Ah, pero Ulises no sabe quedarse calladito, no puede soportar la idea de marcharse sin provocar a su enemigo:</w:t>
       </w:r>
     </w:p>
     <w:p>
@@ -2731,10 +2585,10 @@
         <w:rPr>
           <w:rStyle w:val="FootnoteReference"/>
         </w:rPr>
-        <w:footnoteReference w:id="11"/>
-      </w:r>
-      <w:r>
-        <w:t xml:space="preserve">, lo que me viene bien para insistir en que no me molesta en absoluto que se reinterprete o incluso se reinvente el clásico —yo mismo lo hago y hay una abundante literatura de variantes que enriquece aún más la inmortal épica—. El problema no es, en mi opinión, un cíclope estúpido, sino la falta de ambición para sacarle partido. El Polifemo de Nolan hace lo mismo que el de Homero y no aporta nada a la versión original, mucho más interesante. Pero elimina el architruco de Ulises y apunta a que este se enemista con Poseidón en un acto de justa venganza: le lanza una flecha al cíclope, provocando la ira del dios —como si haberle sacado un ojo a su chico un rato antes no fuera suficiente— por sus hombres asesinados, cuando el propio héroe cuenta, en la corte de Alcínoo, que lo hace por pura arrogancia.</w:t>
+        <w:footnoteReference w:id="12"/>
+      </w:r>
+      <w:r>
+        <w:t xml:space="preserve">, lo que me viene bien para insistir en que no me molesta en absoluto que se reinterprete o incluso se reinvente el clásico. El problema no es un cíclope estúpido, sino la falta de ambición para sacarle partido. El Polifemo de Nolan hace lo mismo que el de Homero y no aporta nada a la versión original, mucho más interesante. Pero elimina el architruco de Ulises y apunta a que este se enemista con Poseidón en un acto de justa venganza: le lanza una flecha al cíclope, provocando la ira del dios —como si haberle sacado un ojo a su chico un rato antes no fuera suficiente— por sus hombres asesinados, cuando el propio héroe cuenta, en la corte de Alcínoo, que lo hace por pura arrogancia.</w:t>
       </w:r>
     </w:p>
     <w:p>
@@ -2992,7 +2846,7 @@
       </w:r>
     </w:p>
   </w:footnote>
-  <w:footnote w:id="9">
+  <w:footnote w:id="10">
     <w:p>
       <w:pPr>
         <w:pStyle w:val="FootnoteText"/>
@@ -3024,7 +2878,7 @@
       </w:r>
     </w:p>
   </w:footnote>
-  <w:footnote w:id="10">
+  <w:footnote w:id="11">
     <w:p>
       <w:pPr>
         <w:pStyle w:val="FootnoteText"/>
@@ -3043,7 +2897,7 @@
       </w:r>
     </w:p>
   </w:footnote>
-  <w:footnote w:id="11">
+  <w:footnote w:id="12">
     <w:p>
       <w:pPr>
         <w:pStyle w:val="FootnoteText"/>
@@ -3058,7 +2912,7 @@
         <w:t xml:space="preserve"> </w:t>
       </w:r>
       <w:r>
-        <w:t xml:space="preserve">Y por si algún mal pensado se lo está preguntando,</w:t>
+        <w:t xml:space="preserve">Y por si algún malpensado se lo está preguntando,</w:t>
       </w:r>
       <w:r>
         <w:t xml:space="preserve"> </w:t>
@@ -3074,18 +2928,7 @@
         <w:t xml:space="preserve"> </w:t>
       </w:r>
       <w:r>
-        <w:t xml:space="preserve">(</w:t>
-      </w:r>
-      <w:hyperlink r:id="rId12">
-        <w:r>
-          <w:rPr>
-            <w:rStyle w:val="Hyperlink"/>
-          </w:rPr>
-          <w:t xml:space="preserve">https://eolasediciones.es/libro/abandonando-itaca-leaving-ithaca/</w:t>
-        </w:r>
-      </w:hyperlink>
-      <w:r>
-        <w:t xml:space="preserve">) precede en un par de años a la película de Nolan.</w:t>
+        <w:t xml:space="preserve">se publicó un año antes de que se estrenara la película de Nolan.</w:t>
       </w:r>
     </w:p>
   </w:footnote>

</xml_diff>